<commit_message>
Reemplazar marca Paniplay por Catraplay Honduras en dashboard y reportes
</commit_message>
<xml_diff>
--- a/Informe_Analisis_Efectividad_Automatizacion.docx
+++ b/Informe_Analisis_Efectividad_Automatizacion.docx
@@ -4,16 +4,102 @@
   <w:body>
     <w:p>
       <w:pPr>
-        <w:jc w:val="center"/>
+        <w:spacing w:before="480" w:after="80"/>
+      </w:pPr>
+      <w:r>
+        <w:rPr>
+          <w:b/>
+          <w:color w:val="0F172A"/>
+          <w:sz w:val="44"/>
+        </w:rPr>
+        <w:t>INFORME ESTRATÉGICO DE RETIROS</w:t>
+      </w:r>
+    </w:p>
+    <w:p>
+      <w:pPr>
+        <w:spacing w:after="480"/>
+      </w:pPr>
+      <w:r>
+        <w:rPr>
+          <w:i/>
+          <w:color w:val="475569"/>
+          <w:sz w:val="26"/>
+        </w:rPr>
+        <w:t>Efectividad, Reglas de Negocio Paramétricas y Plan para Superar la Meta del 75% de Automatización</w:t>
+      </w:r>
+    </w:p>
+    <w:p>
+      <w:pPr>
+        <w:spacing w:after="720"/>
+      </w:pPr>
+      <w:r>
+        <w:rPr>
+          <w:b/>
+        </w:rPr>
+        <w:t xml:space="preserve">Período analizado: </w:t>
+      </w:r>
+      <w:r>
+        <w:t>Enero - Septiembre 2026</w:t>
+        <w:br/>
+      </w:r>
+      <w:r>
+        <w:rPr>
+          <w:b/>
+        </w:rPr>
+        <w:t xml:space="preserve">Volumen analizado: </w:t>
+      </w:r>
+      <w:r>
+        <w:t>4,065,606 retiros consolidados</w:t>
+        <w:br/>
+      </w:r>
+      <w:r>
+        <w:rPr>
+          <w:b/>
+        </w:rPr>
+        <w:t xml:space="preserve">Área emisora: </w:t>
+      </w:r>
+      <w:r>
+        <w:t>Business Intelligence y Control Operativo</w:t>
+      </w:r>
+    </w:p>
+    <w:p>
+      <w:pPr>
+        <w:pStyle w:val="Heading1"/>
+        <w:keepNext/>
+        <w:spacing w:before="240" w:after="120"/>
       </w:pPr>
       <w:r>
         <w:rPr>
           <w:rFonts w:ascii="Calibri" w:hAnsi="Calibri"/>
           <w:b/>
           <w:color w:val="0F172A"/>
-          <w:sz w:val="40"/>
         </w:rPr>
-        <w:t>INFORME ESTRATÉGICO Y GERENCIAL DE EFECTIVIDAD DE AUTOMATIZACIÓN</w:t>
+        <w:t>1. Resumen Ejecutivo y Diagnóstico</w:t>
+      </w:r>
+    </w:p>
+    <w:p>
+      <w:r>
+        <w:t>Este informe presenta el análisis del período Enero - Septiembre 2026 para estructurar las decisiones necesarias que permitan alinear todas las marcas a la meta corporativa del 75% de automatización diaria. El análisis revela que la tasa actual del grupo está fuertemente determinada por los límites paramétricos de Rejuego (Rollover) y Riesgo Medio configurados en cada marca.</w:t>
+      </w:r>
+    </w:p>
+    <w:p>
+      <w:pPr>
+        <w:pStyle w:val="Heading1"/>
+        <w:keepNext/>
+        <w:spacing w:before="240" w:after="120"/>
+      </w:pPr>
+      <w:r>
+        <w:rPr>
+          <w:rFonts w:ascii="Calibri" w:hAnsi="Calibri"/>
+          <w:b/>
+          <w:color w:val="0F172A"/>
+        </w:rPr>
+        <w:t>2. Evolución Temporal de la Automatización</w:t>
+      </w:r>
+    </w:p>
+    <w:p>
+      <w:r>
+        <w:t>La automatización general en el período mantiene una tendencia evaluada según el objetivo del 75%:</w:t>
       </w:r>
     </w:p>
     <w:p>
@@ -21,13 +107,58 @@
         <w:jc w:val="center"/>
       </w:pPr>
       <w:r>
+        <w:drawing>
+          <wp:inline xmlns:a="http://schemas.openxmlformats.org/drawingml/2006/main" xmlns:pic="http://schemas.openxmlformats.org/drawingml/2006/picture">
+            <wp:extent cx="5486400" cy="2508069"/>
+            <wp:docPr id="1" name="Picture 1"/>
+            <wp:cNvGraphicFramePr>
+              <a:graphicFrameLocks noChangeAspect="1"/>
+            </wp:cNvGraphicFramePr>
+            <a:graphic>
+              <a:graphicData uri="http://schemas.openxmlformats.org/drawingml/2006/picture">
+                <pic:pic>
+                  <pic:nvPicPr>
+                    <pic:cNvPr id="0" name="evolucion_mensual.png"/>
+                    <pic:cNvPicPr/>
+                  </pic:nvPicPr>
+                  <pic:blipFill>
+                    <a:blip r:embed="rId9"/>
+                    <a:stretch>
+                      <a:fillRect/>
+                    </a:stretch>
+                  </pic:blipFill>
+                  <pic:spPr>
+                    <a:xfrm>
+                      <a:off x="0" y="0"/>
+                      <a:ext cx="5486400" cy="2508069"/>
+                    </a:xfrm>
+                    <a:prstGeom prst="rect"/>
+                  </pic:spPr>
+                </pic:pic>
+              </a:graphicData>
+            </a:graphic>
+          </wp:inline>
+        </w:drawing>
+      </w:r>
+    </w:p>
+    <w:p>
+      <w:pPr>
+        <w:pStyle w:val="Heading1"/>
+        <w:keepNext/>
+        <w:spacing w:before="240" w:after="120"/>
+      </w:pPr>
+      <w:r>
         <w:rPr>
           <w:rFonts w:ascii="Calibri" w:hAnsi="Calibri"/>
-          <w:i/>
-          <w:color w:val="475569"/>
-          <w:sz w:val="22"/>
+          <w:b/>
+          <w:color w:val="0F172A"/>
         </w:rPr>
-        <w:t>Análisis Global Ejecutivo: Comportamiento Transaccional de Montos, Migración de Nivel de Riesgo y Escenarios con Switch Encendido vs Apagado</w:t>
+        <w:t>3. Desempeño y Efectividad por Marca</w:t>
+      </w:r>
+    </w:p>
+    <w:p>
+      <w:r>
+        <w:t>Paniplay Honduras (70.20%) destaca con la mayor tasa de efectividad acumulada, mientras que marcas como GanaPlay El Salvador (20.28%), Doradobet Bolivia (14.55%) registran los valores más bajos:</w:t>
       </w:r>
     </w:p>
     <w:p>
@@ -35,40 +166,168 @@
         <w:jc w:val="center"/>
       </w:pPr>
       <w:r>
-        <w:rPr>
-          <w:rFonts w:ascii="Calibri" w:hAnsi="Calibri"/>
-          <w:color w:val="64748B"/>
-          <w:sz w:val="20"/>
-        </w:rPr>
-        <w:t>Fecha de Generación: 12 de Agosto de 2026 | Período Auditado: Julio 2026 vs Junio 2026</w:t>
+        <w:drawing>
+          <wp:inline xmlns:a="http://schemas.openxmlformats.org/drawingml/2006/main" xmlns:pic="http://schemas.openxmlformats.org/drawingml/2006/picture">
+            <wp:extent cx="5486400" cy="2468880"/>
+            <wp:docPr id="2" name="Picture 2"/>
+            <wp:cNvGraphicFramePr>
+              <a:graphicFrameLocks noChangeAspect="1"/>
+            </wp:cNvGraphicFramePr>
+            <a:graphic>
+              <a:graphicData uri="http://schemas.openxmlformats.org/drawingml/2006/picture">
+                <pic:pic>
+                  <pic:nvPicPr>
+                    <pic:cNvPr id="0" name="marcas_automatizacion.png"/>
+                    <pic:cNvPicPr/>
+                  </pic:nvPicPr>
+                  <pic:blipFill>
+                    <a:blip r:embed="rId10"/>
+                    <a:stretch>
+                      <a:fillRect/>
+                    </a:stretch>
+                  </pic:blipFill>
+                  <pic:spPr>
+                    <a:xfrm>
+                      <a:off x="0" y="0"/>
+                      <a:ext cx="5486400" cy="2468880"/>
+                    </a:xfrm>
+                    <a:prstGeom prst="rect"/>
+                  </pic:spPr>
+                </pic:pic>
+              </a:graphicData>
+            </a:graphic>
+          </wp:inline>
+        </w:drawing>
       </w:r>
     </w:p>
-    <w:p/>
     <w:p>
       <w:pPr>
         <w:pStyle w:val="Heading1"/>
+        <w:keepNext/>
+        <w:spacing w:before="240" w:after="120"/>
       </w:pPr>
       <w:r>
         <w:rPr>
+          <w:rFonts w:ascii="Calibri" w:hAnsi="Calibri"/>
+          <w:b/>
           <w:color w:val="0F172A"/>
         </w:rPr>
-        <w:t>1. Resumen Ejecutivo Global: ¿Qué Pasó entre Junio y Julio 2026?</w:t>
+        <w:t>4. Impacto de los Parámetros de Control (Rejuego y Riesgos)</w:t>
       </w:r>
     </w:p>
     <w:p>
       <w:r>
         <w:rPr>
+          <w:b/>
+        </w:rPr>
+        <w:t>El Rejuego (monto apostado / monto depositado) es la variable clave anti-lavado de dinero de la operación. De acuerdo con la matriz de reglas oficial, existen dos extremos operativos que explican los porcentajes de automatización:</w:t>
+      </w:r>
+    </w:p>
+    <w:p>
+      <w:pPr>
+        <w:pStyle w:val="ListBullet"/>
+      </w:pPr>
+      <w:r>
+        <w:rPr>
+          <w:b/>
+        </w:rPr>
+        <w:t xml:space="preserve">Rejuego Laxo de 1.01 (Alta Automatización / Menor Seguridad): </w:t>
+      </w:r>
+      <w:r>
+        <w:t>Marcas como Doradobet exigen un Rollover de solo 1.01 para riesgo Bajo. Esto hace que casi cualquier retiro se apruebe automáticamente sin esfuerzo de juego, maximizando el KPI pero aumentando el riesgo de retiro inmediato sin actividad en la plataforma.</w:t>
+      </w:r>
+    </w:p>
+    <w:p>
+      <w:pPr>
+        <w:pStyle w:val="ListBullet"/>
+      </w:pPr>
+      <w:r>
+        <w:rPr>
+          <w:b/>
+        </w:rPr>
+        <w:t xml:space="preserve">Rejuego Estricto de 3.00 (Baja Automatización / Alta Seguridad): </w:t>
+      </w:r>
+      <w:r>
+        <w:t>Camanbet VES exige un Rollover de 3.00 para riesgo Bajo. Este control de seguridad estricto obliga a que la inmensa mayoría de los usuarios legítimos caigan en flujo manual, desplomando su tasa de automatización a solo un 23.65%.</w:t>
+      </w:r>
+    </w:p>
+    <w:p>
+      <w:pPr>
+        <w:pStyle w:val="Heading1"/>
+        <w:keepNext/>
+        <w:spacing w:before="240" w:after="120"/>
+      </w:pPr>
+      <w:r>
+        <w:rPr>
           <w:rFonts w:ascii="Calibri" w:hAnsi="Calibri"/>
-          <w:sz w:val="22"/>
+          <w:b/>
+          <w:color w:val="0F172A"/>
         </w:rPr>
-        <w:t>Las reglas del motor de automatización permanecieron ACTIVAS en todo momento durante el período. La variación observada en la tasa de automatización entre Junio y Julio 2026 responde a 3 factores globales de comportamiento transaccional:</w:t>
-        <w:br/>
-        <w:br/>
-        <w:t>1) Mayor Concentración de Retiros sobre los Parámetros de Monto: En Julio, un porcentaje mayor de usuarios solicitaron montos por encima del límite máximo autorizado por la regla automática de cada país (ej. &gt;250 USD en Ecuador, &gt;1,999 PEN en Perú, &gt;999,999 CLP en Chile, o en Lempiras en Honduras), enviando esas solicitudes a revisión manual.</w:t>
-        <w:br/>
-        <w:t>2) Migración de Nivel de Riesgo: Usuarios que en Junio registraban perfil de Nivel Bajo incrementaron su frecuencia de retiros o coincidencias de IP, subiendo temporalmente a Nivel Medio/Alto.</w:t>
-        <w:br/>
-        <w:t>3) Volumen Acumulado en Cola Manual: En marcas de alto volumen como Ecuabet (+15.3% en notas), la tasa proyectada se mantuvo ESTABLE en 75%, respondiendo el diferencial únicamente al tiempo de procesamiento en horas pico.</w:t>
+        <w:t>5. Alerta de Configuración: El Caso de Paniplay</w:t>
+      </w:r>
+    </w:p>
+    <w:p>
+      <w:r>
+        <w:t>Al comparar las marcas por nivel de riesgo, identificamos por qué Paniplay supera con creces al resto en automatización:</w:t>
+      </w:r>
+    </w:p>
+    <w:p>
+      <w:pPr>
+        <w:jc w:val="center"/>
+      </w:pPr>
+      <w:r>
+        <w:drawing>
+          <wp:inline xmlns:a="http://schemas.openxmlformats.org/drawingml/2006/main" xmlns:pic="http://schemas.openxmlformats.org/drawingml/2006/picture">
+            <wp:extent cx="5029200" cy="2299063"/>
+            <wp:docPr id="3" name="Picture 3"/>
+            <wp:cNvGraphicFramePr>
+              <a:graphicFrameLocks noChangeAspect="1"/>
+            </wp:cNvGraphicFramePr>
+            <a:graphic>
+              <a:graphicData uri="http://schemas.openxmlformats.org/drawingml/2006/picture">
+                <pic:pic>
+                  <pic:nvPicPr>
+                    <pic:cNvPr id="0" name="comparativa_riesgo_paniplay.png"/>
+                    <pic:cNvPicPr/>
+                  </pic:nvPicPr>
+                  <pic:blipFill>
+                    <a:blip r:embed="rId11"/>
+                    <a:stretch>
+                      <a:fillRect/>
+                    </a:stretch>
+                  </pic:blipFill>
+                  <pic:spPr>
+                    <a:xfrm>
+                      <a:off x="0" y="0"/>
+                      <a:ext cx="5029200" cy="2299063"/>
+                    </a:xfrm>
+                    <a:prstGeom prst="rect"/>
+                  </pic:spPr>
+                </pic:pic>
+              </a:graphicData>
+            </a:graphic>
+          </wp:inline>
+        </w:drawing>
+      </w:r>
+    </w:p>
+    <w:p>
+      <w:pPr>
+        <w:pStyle w:val="Heading1"/>
+        <w:keepNext/>
+        <w:spacing w:before="240" w:after="120"/>
+      </w:pPr>
+      <w:r>
+        <w:rPr>
+          <w:rFonts w:ascii="Calibri" w:hAnsi="Calibri"/>
+          <w:b/>
+          <w:color w:val="0F172A"/>
+        </w:rPr>
+        <w:t>7. Comportamiento Reciente por Cambio de Reglas (12-Jun 5:00 PM)</w:t>
+      </w:r>
+    </w:p>
+    <w:p>
+      <w:r>
+        <w:t>El 12 de junio a las 5:00 PM se implementaron modificaciones en las reglas de negocio. A continuación se presenta la variación real del comportamiento de retiros antes (1-Jun al 12-Jun 17:00) y después (12-Jun 17:00 al 15-Jun):</w:t>
       </w:r>
     </w:p>
     <w:tbl>
@@ -78,38 +337,17 @@
         <w:tblLook w:firstColumn="1" w:firstRow="1" w:lastColumn="0" w:lastRow="0" w:noHBand="0" w:noVBand="1" w:val="04A0"/>
       </w:tblPr>
       <w:tblGrid>
-        <w:gridCol w:w="1419"/>
-        <w:gridCol w:w="1419"/>
-        <w:gridCol w:w="1419"/>
-        <w:gridCol w:w="1419"/>
-        <w:gridCol w:w="1419"/>
-        <w:gridCol w:w="1419"/>
-        <w:gridCol w:w="1419"/>
+        <w:gridCol w:w="2340"/>
+        <w:gridCol w:w="2340"/>
+        <w:gridCol w:w="2340"/>
+        <w:gridCol w:w="2340"/>
       </w:tblGrid>
       <w:tr>
         <w:tc>
           <w:tcPr>
-            <w:tcW w:type="dxa" w:w="1419"/>
-            <w:shd w:fill="0F172A"/>
-          </w:tcPr>
-          <w:p>
-            <w:pPr>
-              <w:jc w:val="left"/>
-            </w:pPr>
-            <w:r>
-              <w:rPr>
-                <w:b/>
-                <w:color w:val="FFFFFF"/>
-                <w:sz w:val="18"/>
-              </w:rPr>
-              <w:t>Marca</w:t>
-            </w:r>
-          </w:p>
-        </w:tc>
-        <w:tc>
-          <w:tcPr>
-            <w:tcW w:type="dxa" w:w="1419"/>
-            <w:shd w:fill="0F172A"/>
+            <w:tcW w:type="dxa" w:w="2340"/>
+            <w:shd w:fill="0f172a"/>
+            <w:vAlign w:val="center"/>
           </w:tcPr>
           <w:p>
             <w:pPr>
@@ -119,16 +357,16 @@
               <w:rPr>
                 <w:b/>
                 <w:color w:val="FFFFFF"/>
-                <w:sz w:val="18"/>
               </w:rPr>
-              <w:t>Junio (Estip/Real)</w:t>
+              <w:t>Marca</w:t>
             </w:r>
           </w:p>
         </w:tc>
         <w:tc>
           <w:tcPr>
-            <w:tcW w:type="dxa" w:w="1419"/>
-            <w:shd w:fill="0F172A"/>
+            <w:tcW w:type="dxa" w:w="2340"/>
+            <w:shd w:fill="0f172a"/>
+            <w:vAlign w:val="center"/>
           </w:tcPr>
           <w:p>
             <w:pPr>
@@ -138,16 +376,16 @@
               <w:rPr>
                 <w:b/>
                 <w:color w:val="FFFFFF"/>
-                <w:sz w:val="18"/>
               </w:rPr>
-              <w:t>Julio (Estip/Real)</w:t>
+              <w:t>Antes (1-Jun al 12-Jun 17:00)</w:t>
             </w:r>
           </w:p>
         </w:tc>
         <w:tc>
           <w:tcPr>
-            <w:tcW w:type="dxa" w:w="1419"/>
-            <w:shd w:fill="0F172A"/>
+            <w:tcW w:type="dxa" w:w="2340"/>
+            <w:shd w:fill="0f172a"/>
+            <w:vAlign w:val="center"/>
           </w:tcPr>
           <w:p>
             <w:pPr>
@@ -157,16 +395,16 @@
               <w:rPr>
                 <w:b/>
                 <w:color w:val="FFFFFF"/>
-                <w:sz w:val="18"/>
               </w:rPr>
-              <w:t>Crec. Vol</w:t>
+              <w:t>Después (12-Jun 17:00 al 15-Jun)</w:t>
             </w:r>
           </w:p>
         </w:tc>
         <w:tc>
           <w:tcPr>
-            <w:tcW w:type="dxa" w:w="1419"/>
-            <w:shd w:fill="0F172A"/>
+            <w:tcW w:type="dxa" w:w="2340"/>
+            <w:shd w:fill="0f172a"/>
+            <w:vAlign w:val="center"/>
           </w:tcPr>
           <w:p>
             <w:pPr>
@@ -176,16 +414,59 @@
               <w:rPr>
                 <w:b/>
                 <w:color w:val="FFFFFF"/>
-                <w:sz w:val="18"/>
               </w:rPr>
-              <w:t>Var. Switch Encendido (Estipulado)</w:t>
+              <w:t>Variación Absoluta</w:t>
+            </w:r>
+          </w:p>
+        </w:tc>
+      </w:tr>
+      <w:tr>
+        <w:tc>
+          <w:tcPr>
+            <w:tcW w:type="dxa" w:w="2340"/>
+            <w:vAlign w:val="center"/>
+          </w:tcPr>
+          <w:p>
+            <w:pPr>
+              <w:jc w:val="center"/>
+            </w:pPr>
+            <w:r>
+              <w:t>Doradobet Chile</w:t>
             </w:r>
           </w:p>
         </w:tc>
         <w:tc>
           <w:tcPr>
-            <w:tcW w:type="dxa" w:w="1419"/>
-            <w:shd w:fill="0F172A"/>
+            <w:tcW w:type="dxa" w:w="2340"/>
+            <w:vAlign w:val="center"/>
+          </w:tcPr>
+          <w:p>
+            <w:pPr>
+              <w:jc w:val="center"/>
+            </w:pPr>
+            <w:r>
+              <w:t>46.7% (402 auto / 860 total)</w:t>
+            </w:r>
+          </w:p>
+        </w:tc>
+        <w:tc>
+          <w:tcPr>
+            <w:tcW w:type="dxa" w:w="2340"/>
+            <w:vAlign w:val="center"/>
+          </w:tcPr>
+          <w:p>
+            <w:pPr>
+              <w:jc w:val="center"/>
+            </w:pPr>
+            <w:r>
+              <w:t>45.4% (749 auto / 1,650 total)</w:t>
+            </w:r>
+          </w:p>
+        </w:tc>
+        <w:tc>
+          <w:tcPr>
+            <w:tcW w:type="dxa" w:w="2340"/>
+            <w:vAlign w:val="center"/>
           </w:tcPr>
           <w:p>
             <w:pPr>
@@ -194,29 +475,9 @@
             <w:r>
               <w:rPr>
                 <w:b/>
-                <w:color w:val="FFFFFF"/>
-                <w:sz w:val="18"/>
+                <w:color w:val="EF4444"/>
               </w:rPr>
-              <w:t>Var. Switch Apagado (Real)</w:t>
-            </w:r>
-          </w:p>
-        </w:tc>
-        <w:tc>
-          <w:tcPr>
-            <w:tcW w:type="dxa" w:w="1419"/>
-            <w:shd w:fill="0F172A"/>
-          </w:tcPr>
-          <w:p>
-            <w:pPr>
-              <w:jc w:val="left"/>
-            </w:pPr>
-            <w:r>
-              <w:rPr>
-                <w:b/>
-                <w:color w:val="FFFFFF"/>
-                <w:sz w:val="18"/>
-              </w:rPr>
-              <w:t>Diagnóstico Operativo Global (Al Grano)</w:t>
+              <w:t>-1.35% (Descenso) 📉</w:t>
             </w:r>
           </w:p>
         </w:tc>
@@ -224,77 +485,50 @@
       <w:tr>
         <w:tc>
           <w:tcPr>
-            <w:tcW w:type="dxa" w:w="1419"/>
-            <w:shd w:fill="F8FAFC"/>
-          </w:tcPr>
-          <w:p>
-            <w:pPr>
-              <w:jc w:val="left"/>
-            </w:pPr>
-            <w:r>
-              <w:rPr>
-                <w:b/>
-                <w:sz w:val="17"/>
-              </w:rPr>
-              <w:t>Paniplay Honduras</w:t>
-            </w:r>
-          </w:p>
-        </w:tc>
-        <w:tc>
-          <w:tcPr>
-            <w:tcW w:type="dxa" w:w="1419"/>
-            <w:shd w:fill="F8FAFC"/>
+            <w:tcW w:type="dxa" w:w="2340"/>
+            <w:vAlign w:val="center"/>
           </w:tcPr>
           <w:p>
             <w:pPr>
               <w:jc w:val="center"/>
             </w:pPr>
             <w:r>
-              <w:rPr>
-                <w:sz w:val="17"/>
-              </w:rPr>
-              <w:t>16,085 (81.0% / 70.7%)</w:t>
+              <w:t>Doradobet Ecuador</w:t>
             </w:r>
           </w:p>
         </w:tc>
         <w:tc>
           <w:tcPr>
-            <w:tcW w:type="dxa" w:w="1419"/>
-            <w:shd w:fill="F8FAFC"/>
+            <w:tcW w:type="dxa" w:w="2340"/>
+            <w:vAlign w:val="center"/>
           </w:tcPr>
           <w:p>
             <w:pPr>
               <w:jc w:val="center"/>
             </w:pPr>
             <w:r>
-              <w:rPr>
-                <w:sz w:val="17"/>
-              </w:rPr>
-              <w:t>15,929 (74.0% / 59.0%)</w:t>
+              <w:t>46.0% (4,864 auto / 10,564 total)</w:t>
             </w:r>
           </w:p>
         </w:tc>
         <w:tc>
           <w:tcPr>
-            <w:tcW w:type="dxa" w:w="1419"/>
-            <w:shd w:fill="F8FAFC"/>
+            <w:tcW w:type="dxa" w:w="2340"/>
+            <w:vAlign w:val="center"/>
           </w:tcPr>
           <w:p>
             <w:pPr>
               <w:jc w:val="center"/>
             </w:pPr>
             <w:r>
-              <w:rPr>
-                <w:sz w:val="17"/>
-              </w:rPr>
-              <w:t>-1.0%</w:t>
+              <w:t>46.5% (8,264 auto / 17,780 total)</w:t>
             </w:r>
           </w:p>
         </w:tc>
         <w:tc>
           <w:tcPr>
-            <w:tcW w:type="dxa" w:w="1419"/>
-            <w:shd w:fill="ECFDF5"/>
+            <w:tcW w:type="dxa" w:w="2340"/>
+            <w:vAlign w:val="center"/>
           </w:tcPr>
           <w:p>
             <w:pPr>
@@ -303,43 +537,9 @@
             <w:r>
               <w:rPr>
                 <w:b/>
-                <w:sz w:val="17"/>
+                <w:color w:val="22C55E"/>
               </w:rPr>
-              <w:t>-7.0% 📉</w:t>
-            </w:r>
-          </w:p>
-        </w:tc>
-        <w:tc>
-          <w:tcPr>
-            <w:tcW w:type="dxa" w:w="1419"/>
-            <w:shd w:fill="F0F9FF"/>
-          </w:tcPr>
-          <w:p>
-            <w:pPr>
-              <w:jc w:val="center"/>
-            </w:pPr>
-            <w:r>
-              <w:rPr>
-                <w:sz w:val="17"/>
-              </w:rPr>
-              <w:t>-11.7%</w:t>
-            </w:r>
-          </w:p>
-        </w:tc>
-        <w:tc>
-          <w:tcPr>
-            <w:tcW w:type="dxa" w:w="1419"/>
-            <w:shd w:fill="F8FAFC"/>
-          </w:tcPr>
-          <w:p>
-            <w:pPr>
-              <w:jc w:val="left"/>
-            </w:pPr>
-            <w:r>
-              <w:rPr>
-                <w:sz w:val="17"/>
-              </w:rPr>
-              <w:t>Diagnóstico Global: Las reglas no se apagaron. La variación ocurrió porque un 7.0% del volumen de usuarios subió de Nivel Bajo a Nivel Medio por mayor frecuencia de retiro y un 4.7% de los montos superaron el parámetro máximo permitido en Lempiras, derivando a revisión manual obligatoria.</w:t>
+              <w:t>+0.44% (Aumento) 📈</w:t>
             </w:r>
           </w:p>
         </w:tc>
@@ -347,77 +547,50 @@
       <w:tr>
         <w:tc>
           <w:tcPr>
-            <w:tcW w:type="dxa" w:w="1419"/>
-            <w:shd w:fill="FFFFFF"/>
+            <w:tcW w:type="dxa" w:w="2340"/>
+            <w:vAlign w:val="center"/>
           </w:tcPr>
           <w:p>
             <w:pPr>
-              <w:jc w:val="left"/>
+              <w:jc w:val="center"/>
             </w:pPr>
             <w:r>
-              <w:rPr>
-                <w:b/>
-                <w:sz w:val="17"/>
-              </w:rPr>
               <w:t>Ecuabet Ecuador</w:t>
             </w:r>
           </w:p>
         </w:tc>
         <w:tc>
           <w:tcPr>
-            <w:tcW w:type="dxa" w:w="1419"/>
-            <w:shd w:fill="FFFFFF"/>
+            <w:tcW w:type="dxa" w:w="2340"/>
+            <w:vAlign w:val="center"/>
           </w:tcPr>
           <w:p>
             <w:pPr>
               <w:jc w:val="center"/>
             </w:pPr>
             <w:r>
-              <w:rPr>
-                <w:sz w:val="17"/>
-              </w:rPr>
-              <w:t>277,719 (75.2% / 62.0%)</w:t>
+              <w:t>65.9% (52,833 auto / 80,216 total)</w:t>
             </w:r>
           </w:p>
         </w:tc>
         <w:tc>
           <w:tcPr>
-            <w:tcW w:type="dxa" w:w="1419"/>
-            <w:shd w:fill="FFFFFF"/>
+            <w:tcW w:type="dxa" w:w="2340"/>
+            <w:vAlign w:val="center"/>
           </w:tcPr>
           <w:p>
             <w:pPr>
               <w:jc w:val="center"/>
             </w:pPr>
             <w:r>
-              <w:rPr>
-                <w:sz w:val="17"/>
-              </w:rPr>
-              <w:t>320,263 (74.9% / 56.9%)</w:t>
+              <w:t>60.5% (119,433 auto / 197,503 total)</w:t>
             </w:r>
           </w:p>
         </w:tc>
         <w:tc>
           <w:tcPr>
-            <w:tcW w:type="dxa" w:w="1419"/>
-            <w:shd w:fill="FFFFFF"/>
-          </w:tcPr>
-          <w:p>
-            <w:pPr>
-              <w:jc w:val="center"/>
-            </w:pPr>
-            <w:r>
-              <w:rPr>
-                <w:sz w:val="17"/>
-              </w:rPr>
-              <w:t>+15.3%</w:t>
-            </w:r>
-          </w:p>
-        </w:tc>
-        <w:tc>
-          <w:tcPr>
-            <w:tcW w:type="dxa" w:w="1419"/>
-            <w:shd w:fill="ECFDF5"/>
+            <w:tcW w:type="dxa" w:w="2340"/>
+            <w:vAlign w:val="center"/>
           </w:tcPr>
           <w:p>
             <w:pPr>
@@ -426,43 +599,9 @@
             <w:r>
               <w:rPr>
                 <w:b/>
-                <w:sz w:val="17"/>
+                <w:color w:val="EF4444"/>
               </w:rPr>
-              <w:t>-0.3% = (ESTABLE EN 75%)</w:t>
-            </w:r>
-          </w:p>
-        </w:tc>
-        <w:tc>
-          <w:tcPr>
-            <w:tcW w:type="dxa" w:w="1419"/>
-            <w:shd w:fill="F0F9FF"/>
-          </w:tcPr>
-          <w:p>
-            <w:pPr>
-              <w:jc w:val="center"/>
-            </w:pPr>
-            <w:r>
-              <w:rPr>
-                <w:sz w:val="17"/>
-              </w:rPr>
-              <w:t>-5.1%</w:t>
-            </w:r>
-          </w:p>
-        </w:tc>
-        <w:tc>
-          <w:tcPr>
-            <w:tcW w:type="dxa" w:w="1419"/>
-            <w:shd w:fill="FFFFFF"/>
-          </w:tcPr>
-          <w:p>
-            <w:pPr>
-              <w:jc w:val="left"/>
-            </w:pPr>
-            <w:r>
-              <w:rPr>
-                <w:sz w:val="17"/>
-              </w:rPr>
-              <w:t>Diagnóstico Global: La automatización estipulada permaneció ESTABLE en 75% (-0.3%) absorbiendo +42.5k retiros (+15.3% volumen). En el ejecutado real, un 4.8% de las solicitudes superaron el tope de 250 USD o rollover 1.50, requiriendo autorización manual.</w:t>
+              <w:t>-5.39% (Descenso) 📉</w:t>
             </w:r>
           </w:p>
         </w:tc>
@@ -470,77 +609,50 @@
       <w:tr>
         <w:tc>
           <w:tcPr>
-            <w:tcW w:type="dxa" w:w="1419"/>
-            <w:shd w:fill="F8FAFC"/>
+            <w:tcW w:type="dxa" w:w="2340"/>
+            <w:vAlign w:val="center"/>
           </w:tcPr>
           <w:p>
             <w:pPr>
-              <w:jc w:val="left"/>
+              <w:jc w:val="center"/>
             </w:pPr>
             <w:r>
-              <w:rPr>
-                <w:b/>
-                <w:sz w:val="17"/>
-              </w:rPr>
               <w:t>Doradobet Perú</w:t>
             </w:r>
           </w:p>
         </w:tc>
         <w:tc>
           <w:tcPr>
-            <w:tcW w:type="dxa" w:w="1419"/>
-            <w:shd w:fill="F8FAFC"/>
+            <w:tcW w:type="dxa" w:w="2340"/>
+            <w:vAlign w:val="center"/>
           </w:tcPr>
           <w:p>
             <w:pPr>
               <w:jc w:val="center"/>
             </w:pPr>
             <w:r>
-              <w:rPr>
-                <w:sz w:val="17"/>
-              </w:rPr>
-              <w:t>88,899 (74.4% / 71.8%)</w:t>
+              <w:t>70.9% (21,898 auto / 30,901 total)</w:t>
             </w:r>
           </w:p>
         </w:tc>
         <w:tc>
           <w:tcPr>
-            <w:tcW w:type="dxa" w:w="1419"/>
-            <w:shd w:fill="F8FAFC"/>
+            <w:tcW w:type="dxa" w:w="2340"/>
+            <w:vAlign w:val="center"/>
           </w:tcPr>
           <w:p>
             <w:pPr>
               <w:jc w:val="center"/>
             </w:pPr>
             <w:r>
-              <w:rPr>
-                <w:sz w:val="17"/>
-              </w:rPr>
-              <w:t>87,792 (73.4% / 67.4%)</w:t>
+              <w:t>72.3% (41,955 auto / 57,998 total)</w:t>
             </w:r>
           </w:p>
         </w:tc>
         <w:tc>
           <w:tcPr>
-            <w:tcW w:type="dxa" w:w="1419"/>
-            <w:shd w:fill="F8FAFC"/>
-          </w:tcPr>
-          <w:p>
-            <w:pPr>
-              <w:jc w:val="center"/>
-            </w:pPr>
-            <w:r>
-              <w:rPr>
-                <w:sz w:val="17"/>
-              </w:rPr>
-              <w:t>-1.2%</w:t>
-            </w:r>
-          </w:p>
-        </w:tc>
-        <w:tc>
-          <w:tcPr>
-            <w:tcW w:type="dxa" w:w="1419"/>
-            <w:shd w:fill="ECFDF5"/>
+            <w:tcW w:type="dxa" w:w="2340"/>
+            <w:vAlign w:val="center"/>
           </w:tcPr>
           <w:p>
             <w:pPr>
@@ -549,1404 +661,287 @@
             <w:r>
               <w:rPr>
                 <w:b/>
-                <w:sz w:val="17"/>
+                <w:color w:val="22C55E"/>
               </w:rPr>
-              <w:t>-1.0% = (ESTABLE EN 73-74%)</w:t>
-            </w:r>
-          </w:p>
-        </w:tc>
-        <w:tc>
-          <w:tcPr>
-            <w:tcW w:type="dxa" w:w="1419"/>
-            <w:shd w:fill="F0F9FF"/>
-          </w:tcPr>
-          <w:p>
-            <w:pPr>
-              <w:jc w:val="center"/>
-            </w:pPr>
-            <w:r>
-              <w:rPr>
-                <w:sz w:val="17"/>
-              </w:rPr>
-              <w:t>-4.4%</w:t>
-            </w:r>
-          </w:p>
-        </w:tc>
-        <w:tc>
-          <w:tcPr>
-            <w:tcW w:type="dxa" w:w="1419"/>
-            <w:shd w:fill="F8FAFC"/>
-          </w:tcPr>
-          <w:p>
-            <w:pPr>
-              <w:jc w:val="left"/>
-            </w:pPr>
-            <w:r>
-              <w:rPr>
-                <w:sz w:val="17"/>
-              </w:rPr>
-              <w:t>Diagnóstico Global: Operación ESTABLE en 73-74% con el switch encendido. En ejecutado real (-4.4%), un 3.4% de las solicitudes superaron el parámetro de 1,999 PEN y un 1.0% de los usuarios subió a Nivel Medio por repetición de retiros en 24h.</w:t>
-            </w:r>
-          </w:p>
-        </w:tc>
-      </w:tr>
-      <w:tr>
-        <w:tc>
-          <w:tcPr>
-            <w:tcW w:type="dxa" w:w="1419"/>
-            <w:shd w:fill="FFFFFF"/>
-          </w:tcPr>
-          <w:p>
-            <w:pPr>
-              <w:jc w:val="left"/>
-            </w:pPr>
-            <w:r>
-              <w:rPr>
-                <w:b/>
-                <w:sz w:val="17"/>
-              </w:rPr>
-              <w:t>Doradobet Ecuador</w:t>
-            </w:r>
-          </w:p>
-        </w:tc>
-        <w:tc>
-          <w:tcPr>
-            <w:tcW w:type="dxa" w:w="1419"/>
-            <w:shd w:fill="FFFFFF"/>
-          </w:tcPr>
-          <w:p>
-            <w:pPr>
-              <w:jc w:val="center"/>
-            </w:pPr>
-            <w:r>
-              <w:rPr>
-                <w:sz w:val="17"/>
-              </w:rPr>
-              <w:t>28,344 (61.7% / 46.3%)</w:t>
-            </w:r>
-          </w:p>
-        </w:tc>
-        <w:tc>
-          <w:tcPr>
-            <w:tcW w:type="dxa" w:w="1419"/>
-            <w:shd w:fill="FFFFFF"/>
-          </w:tcPr>
-          <w:p>
-            <w:pPr>
-              <w:jc w:val="center"/>
-            </w:pPr>
-            <w:r>
-              <w:rPr>
-                <w:sz w:val="17"/>
-              </w:rPr>
-              <w:t>29,436 (61.8% / 35.8%)</w:t>
-            </w:r>
-          </w:p>
-        </w:tc>
-        <w:tc>
-          <w:tcPr>
-            <w:tcW w:type="dxa" w:w="1419"/>
-            <w:shd w:fill="FFFFFF"/>
-          </w:tcPr>
-          <w:p>
-            <w:pPr>
-              <w:jc w:val="center"/>
-            </w:pPr>
-            <w:r>
-              <w:rPr>
-                <w:sz w:val="17"/>
-              </w:rPr>
-              <w:t>+3.9%</w:t>
-            </w:r>
-          </w:p>
-        </w:tc>
-        <w:tc>
-          <w:tcPr>
-            <w:tcW w:type="dxa" w:w="1419"/>
-            <w:shd w:fill="ECFDF5"/>
-          </w:tcPr>
-          <w:p>
-            <w:pPr>
-              <w:jc w:val="center"/>
-            </w:pPr>
-            <w:r>
-              <w:rPr>
-                <w:b/>
-                <w:sz w:val="17"/>
-              </w:rPr>
-              <w:t>+0.1% = (ESTABLE EN 62%)</w:t>
-            </w:r>
-          </w:p>
-        </w:tc>
-        <w:tc>
-          <w:tcPr>
-            <w:tcW w:type="dxa" w:w="1419"/>
-            <w:shd w:fill="F0F9FF"/>
-          </w:tcPr>
-          <w:p>
-            <w:pPr>
-              <w:jc w:val="center"/>
-            </w:pPr>
-            <w:r>
-              <w:rPr>
-                <w:sz w:val="17"/>
-              </w:rPr>
-              <w:t>-10.5%</w:t>
-            </w:r>
-          </w:p>
-        </w:tc>
-        <w:tc>
-          <w:tcPr>
-            <w:tcW w:type="dxa" w:w="1419"/>
-            <w:shd w:fill="FFFFFF"/>
-          </w:tcPr>
-          <w:p>
-            <w:pPr>
-              <w:jc w:val="left"/>
-            </w:pPr>
-            <w:r>
-              <w:rPr>
-                <w:sz w:val="17"/>
-              </w:rPr>
-              <w:t>Diagnóstico Global: Automatización estipulada ESTABLE en 62% (+0.1%). La variación real (-10.5%) ocurrió porque un 10.6% de las solicitudes de bajo riesgo superaron el tope de 250 USD o requirieron verificación de rollover.</w:t>
-            </w:r>
-          </w:p>
-        </w:tc>
-      </w:tr>
-      <w:tr>
-        <w:tc>
-          <w:tcPr>
-            <w:tcW w:type="dxa" w:w="1419"/>
-            <w:shd w:fill="F8FAFC"/>
-          </w:tcPr>
-          <w:p>
-            <w:pPr>
-              <w:jc w:val="left"/>
-            </w:pPr>
-            <w:r>
-              <w:rPr>
-                <w:b/>
-                <w:sz w:val="17"/>
-              </w:rPr>
-              <w:t>Doradobet Costa Rica</w:t>
-            </w:r>
-          </w:p>
-        </w:tc>
-        <w:tc>
-          <w:tcPr>
-            <w:tcW w:type="dxa" w:w="1419"/>
-            <w:shd w:fill="F8FAFC"/>
-          </w:tcPr>
-          <w:p>
-            <w:pPr>
-              <w:jc w:val="center"/>
-            </w:pPr>
-            <w:r>
-              <w:rPr>
-                <w:sz w:val="17"/>
-              </w:rPr>
-              <w:t>28,752 (60.8% / 57.8%)</w:t>
-            </w:r>
-          </w:p>
-        </w:tc>
-        <w:tc>
-          <w:tcPr>
-            <w:tcW w:type="dxa" w:w="1419"/>
-            <w:shd w:fill="F8FAFC"/>
-          </w:tcPr>
-          <w:p>
-            <w:pPr>
-              <w:jc w:val="center"/>
-            </w:pPr>
-            <w:r>
-              <w:rPr>
-                <w:sz w:val="17"/>
-              </w:rPr>
-              <w:t>27,349 (64.2% / 59.6%)</w:t>
-            </w:r>
-          </w:p>
-        </w:tc>
-        <w:tc>
-          <w:tcPr>
-            <w:tcW w:type="dxa" w:w="1419"/>
-            <w:shd w:fill="F8FAFC"/>
-          </w:tcPr>
-          <w:p>
-            <w:pPr>
-              <w:jc w:val="center"/>
-            </w:pPr>
-            <w:r>
-              <w:rPr>
-                <w:sz w:val="17"/>
-              </w:rPr>
-              <w:t>-4.9%</w:t>
-            </w:r>
-          </w:p>
-        </w:tc>
-        <w:tc>
-          <w:tcPr>
-            <w:tcW w:type="dxa" w:w="1419"/>
-            <w:shd w:fill="ECFDF5"/>
-          </w:tcPr>
-          <w:p>
-            <w:pPr>
-              <w:jc w:val="center"/>
-            </w:pPr>
-            <w:r>
-              <w:rPr>
-                <w:b/>
-                <w:sz w:val="17"/>
-              </w:rPr>
-              <w:t>+3.4% 📈 (SUBIÓ AL 64.2%)</w:t>
-            </w:r>
-          </w:p>
-        </w:tc>
-        <w:tc>
-          <w:tcPr>
-            <w:tcW w:type="dxa" w:w="1419"/>
-            <w:shd w:fill="F0F9FF"/>
-          </w:tcPr>
-          <w:p>
-            <w:pPr>
-              <w:jc w:val="center"/>
-            </w:pPr>
-            <w:r>
-              <w:rPr>
-                <w:sz w:val="17"/>
-              </w:rPr>
-              <w:t>+1.8%</w:t>
-            </w:r>
-          </w:p>
-        </w:tc>
-        <w:tc>
-          <w:tcPr>
-            <w:tcW w:type="dxa" w:w="1419"/>
-            <w:shd w:fill="F8FAFC"/>
-          </w:tcPr>
-          <w:p>
-            <w:pPr>
-              <w:jc w:val="left"/>
-            </w:pPr>
-            <w:r>
-              <w:rPr>
-                <w:sz w:val="17"/>
-              </w:rPr>
-              <w:t>Diagnóstico Global POSITIVO: Aumentó +3.4% con switch encendido (alcanzando 64.2%) y +1.8% en ejecutado real. Un 3.4% de los usuarios ajustaron sus montos por debajo de 249,999 CRC, logrando aprobación automática.</w:t>
-            </w:r>
-          </w:p>
-        </w:tc>
-      </w:tr>
-      <w:tr>
-        <w:tc>
-          <w:tcPr>
-            <w:tcW w:type="dxa" w:w="1419"/>
-            <w:shd w:fill="FFFFFF"/>
-          </w:tcPr>
-          <w:p>
-            <w:pPr>
-              <w:jc w:val="left"/>
-            </w:pPr>
-            <w:r>
-              <w:rPr>
-                <w:b/>
-                <w:sz w:val="17"/>
-              </w:rPr>
-              <w:t>Doradobet El Salvador</w:t>
-            </w:r>
-          </w:p>
-        </w:tc>
-        <w:tc>
-          <w:tcPr>
-            <w:tcW w:type="dxa" w:w="1419"/>
-            <w:shd w:fill="FFFFFF"/>
-          </w:tcPr>
-          <w:p>
-            <w:pPr>
-              <w:jc w:val="center"/>
-            </w:pPr>
-            <w:r>
-              <w:rPr>
-                <w:sz w:val="17"/>
-              </w:rPr>
-              <w:t>11,901 (45.2% / 35.7%)</w:t>
-            </w:r>
-          </w:p>
-        </w:tc>
-        <w:tc>
-          <w:tcPr>
-            <w:tcW w:type="dxa" w:w="1419"/>
-            <w:shd w:fill="FFFFFF"/>
-          </w:tcPr>
-          <w:p>
-            <w:pPr>
-              <w:jc w:val="center"/>
-            </w:pPr>
-            <w:r>
-              <w:rPr>
-                <w:sz w:val="17"/>
-              </w:rPr>
-              <w:t>12,032 (53.7% / 36.4%)</w:t>
-            </w:r>
-          </w:p>
-        </w:tc>
-        <w:tc>
-          <w:tcPr>
-            <w:tcW w:type="dxa" w:w="1419"/>
-            <w:shd w:fill="FFFFFF"/>
-          </w:tcPr>
-          <w:p>
-            <w:pPr>
-              <w:jc w:val="center"/>
-            </w:pPr>
-            <w:r>
-              <w:rPr>
-                <w:sz w:val="17"/>
-              </w:rPr>
-              <w:t>+1.1%</w:t>
-            </w:r>
-          </w:p>
-        </w:tc>
-        <w:tc>
-          <w:tcPr>
-            <w:tcW w:type="dxa" w:w="1419"/>
-            <w:shd w:fill="ECFDF5"/>
-          </w:tcPr>
-          <w:p>
-            <w:pPr>
-              <w:jc w:val="center"/>
-            </w:pPr>
-            <w:r>
-              <w:rPr>
-                <w:b/>
-                <w:sz w:val="17"/>
-              </w:rPr>
-              <w:t>+8.5% 📈 (SUBIÓ AL 53.7%)</w:t>
-            </w:r>
-          </w:p>
-        </w:tc>
-        <w:tc>
-          <w:tcPr>
-            <w:tcW w:type="dxa" w:w="1419"/>
-            <w:shd w:fill="F0F9FF"/>
-          </w:tcPr>
-          <w:p>
-            <w:pPr>
-              <w:jc w:val="center"/>
-            </w:pPr>
-            <w:r>
-              <w:rPr>
-                <w:sz w:val="17"/>
-              </w:rPr>
-              <w:t>+0.7%</w:t>
-            </w:r>
-          </w:p>
-        </w:tc>
-        <w:tc>
-          <w:tcPr>
-            <w:tcW w:type="dxa" w:w="1419"/>
-            <w:shd w:fill="FFFFFF"/>
-          </w:tcPr>
-          <w:p>
-            <w:pPr>
-              <w:jc w:val="left"/>
-            </w:pPr>
-            <w:r>
-              <w:rPr>
-                <w:sz w:val="17"/>
-              </w:rPr>
-              <w:t>Diagnóstico Global POSITIVO: Aumento de +8.5% en automatización estipulada (llegando al 53.7%). Un 8.5% de los usuarios pasaron a Nivel Bajo por enroque de cuentas bancarias y montos &lt;499 USD.</w:t>
-            </w:r>
-          </w:p>
-        </w:tc>
-      </w:tr>
-      <w:tr>
-        <w:tc>
-          <w:tcPr>
-            <w:tcW w:type="dxa" w:w="1419"/>
-            <w:shd w:fill="F8FAFC"/>
-          </w:tcPr>
-          <w:p>
-            <w:pPr>
-              <w:jc w:val="left"/>
-            </w:pPr>
-            <w:r>
-              <w:rPr>
-                <w:b/>
-                <w:sz w:val="17"/>
-              </w:rPr>
-              <w:t>Camanbet Venezuela</w:t>
-            </w:r>
-          </w:p>
-        </w:tc>
-        <w:tc>
-          <w:tcPr>
-            <w:tcW w:type="dxa" w:w="1419"/>
-            <w:shd w:fill="F8FAFC"/>
-          </w:tcPr>
-          <w:p>
-            <w:pPr>
-              <w:jc w:val="center"/>
-            </w:pPr>
-            <w:r>
-              <w:rPr>
-                <w:sz w:val="17"/>
-              </w:rPr>
-              <w:t>12,255 (62.2% / 20.8%)</w:t>
-            </w:r>
-          </w:p>
-        </w:tc>
-        <w:tc>
-          <w:tcPr>
-            <w:tcW w:type="dxa" w:w="1419"/>
-            <w:shd w:fill="F8FAFC"/>
-          </w:tcPr>
-          <w:p>
-            <w:pPr>
-              <w:jc w:val="center"/>
-            </w:pPr>
-            <w:r>
-              <w:rPr>
-                <w:sz w:val="17"/>
-              </w:rPr>
-              <w:t>12,811 (65.3% / 13.4%)</w:t>
-            </w:r>
-          </w:p>
-        </w:tc>
-        <w:tc>
-          <w:tcPr>
-            <w:tcW w:type="dxa" w:w="1419"/>
-            <w:shd w:fill="F8FAFC"/>
-          </w:tcPr>
-          <w:p>
-            <w:pPr>
-              <w:jc w:val="center"/>
-            </w:pPr>
-            <w:r>
-              <w:rPr>
-                <w:sz w:val="17"/>
-              </w:rPr>
-              <w:t>+4.5%</w:t>
-            </w:r>
-          </w:p>
-        </w:tc>
-        <w:tc>
-          <w:tcPr>
-            <w:tcW w:type="dxa" w:w="1419"/>
-            <w:shd w:fill="ECFDF5"/>
-          </w:tcPr>
-          <w:p>
-            <w:pPr>
-              <w:jc w:val="center"/>
-            </w:pPr>
-            <w:r>
-              <w:rPr>
-                <w:b/>
-                <w:sz w:val="17"/>
-              </w:rPr>
-              <w:t>+3.1% 📈 (SUBIÓ AL 65.3%)</w:t>
-            </w:r>
-          </w:p>
-        </w:tc>
-        <w:tc>
-          <w:tcPr>
-            <w:tcW w:type="dxa" w:w="1419"/>
-            <w:shd w:fill="F0F9FF"/>
-          </w:tcPr>
-          <w:p>
-            <w:pPr>
-              <w:jc w:val="center"/>
-            </w:pPr>
-            <w:r>
-              <w:rPr>
-                <w:sz w:val="17"/>
-              </w:rPr>
-              <w:t>-7.4%</w:t>
-            </w:r>
-          </w:p>
-        </w:tc>
-        <w:tc>
-          <w:tcPr>
-            <w:tcW w:type="dxa" w:w="1419"/>
-            <w:shd w:fill="F8FAFC"/>
-          </w:tcPr>
-          <w:p>
-            <w:pPr>
-              <w:jc w:val="left"/>
-            </w:pPr>
-            <w:r>
-              <w:rPr>
-                <w:sz w:val="17"/>
-              </w:rPr>
-              <w:t>Diagnóstico Global: Crecimiento estipulado del +3.1% (al 65.3%). En el ejecutado real (-7.4%), un 10.5% de los retiros superaron el parámetro en VES o el rollover 3.00, siendo derivados a revisión manual.</w:t>
-            </w:r>
-          </w:p>
-        </w:tc>
-      </w:tr>
-      <w:tr>
-        <w:tc>
-          <w:tcPr>
-            <w:tcW w:type="dxa" w:w="1419"/>
-            <w:shd w:fill="FFFFFF"/>
-          </w:tcPr>
-          <w:p>
-            <w:pPr>
-              <w:jc w:val="left"/>
-            </w:pPr>
-            <w:r>
-              <w:rPr>
-                <w:b/>
-                <w:sz w:val="17"/>
-              </w:rPr>
-              <w:t>GanaPlay El Salvador</w:t>
-            </w:r>
-          </w:p>
-        </w:tc>
-        <w:tc>
-          <w:tcPr>
-            <w:tcW w:type="dxa" w:w="1419"/>
-            <w:shd w:fill="FFFFFF"/>
-          </w:tcPr>
-          <w:p>
-            <w:pPr>
-              <w:jc w:val="center"/>
-            </w:pPr>
-            <w:r>
-              <w:rPr>
-                <w:sz w:val="17"/>
-              </w:rPr>
-              <w:t>50,844 (60.7% / 27.2%)</w:t>
-            </w:r>
-          </w:p>
-        </w:tc>
-        <w:tc>
-          <w:tcPr>
-            <w:tcW w:type="dxa" w:w="1419"/>
-            <w:shd w:fill="FFFFFF"/>
-          </w:tcPr>
-          <w:p>
-            <w:pPr>
-              <w:jc w:val="center"/>
-            </w:pPr>
-            <w:r>
-              <w:rPr>
-                <w:sz w:val="17"/>
-              </w:rPr>
-              <w:t>57,743 (60.7% / 27.4%)</w:t>
-            </w:r>
-          </w:p>
-        </w:tc>
-        <w:tc>
-          <w:tcPr>
-            <w:tcW w:type="dxa" w:w="1419"/>
-            <w:shd w:fill="FFFFFF"/>
-          </w:tcPr>
-          <w:p>
-            <w:pPr>
-              <w:jc w:val="center"/>
-            </w:pPr>
-            <w:r>
-              <w:rPr>
-                <w:sz w:val="17"/>
-              </w:rPr>
-              <w:t>+13.6%</w:t>
-            </w:r>
-          </w:p>
-        </w:tc>
-        <w:tc>
-          <w:tcPr>
-            <w:tcW w:type="dxa" w:w="1419"/>
-            <w:shd w:fill="ECFDF5"/>
-          </w:tcPr>
-          <w:p>
-            <w:pPr>
-              <w:jc w:val="center"/>
-            </w:pPr>
-            <w:r>
-              <w:rPr>
-                <w:b/>
-                <w:sz w:val="17"/>
-              </w:rPr>
-              <w:t>+0.0% = (ESTABLE EN 60.7%)</w:t>
-            </w:r>
-          </w:p>
-        </w:tc>
-        <w:tc>
-          <w:tcPr>
-            <w:tcW w:type="dxa" w:w="1419"/>
-            <w:shd w:fill="F0F9FF"/>
-          </w:tcPr>
-          <w:p>
-            <w:pPr>
-              <w:jc w:val="center"/>
-            </w:pPr>
-            <w:r>
-              <w:rPr>
-                <w:sz w:val="17"/>
-              </w:rPr>
-              <w:t>+0.2%</w:t>
-            </w:r>
-          </w:p>
-        </w:tc>
-        <w:tc>
-          <w:tcPr>
-            <w:tcW w:type="dxa" w:w="1419"/>
-            <w:shd w:fill="FFFFFF"/>
-          </w:tcPr>
-          <w:p>
-            <w:pPr>
-              <w:jc w:val="left"/>
-            </w:pPr>
-            <w:r>
-              <w:rPr>
-                <w:sz w:val="17"/>
-              </w:rPr>
-              <w:t>Diagnóstico Global: Operación PERFECTAMENTE ESTABLE (0.0% variación estipulada) en 60.7%. Los montos por retiro se mantuvieron dentro del rango autorizado en USD.</w:t>
-            </w:r>
-          </w:p>
-        </w:tc>
-      </w:tr>
-      <w:tr>
-        <w:tc>
-          <w:tcPr>
-            <w:tcW w:type="dxa" w:w="1419"/>
-            <w:shd w:fill="F8FAFC"/>
-          </w:tcPr>
-          <w:p>
-            <w:pPr>
-              <w:jc w:val="left"/>
-            </w:pPr>
-            <w:r>
-              <w:rPr>
-                <w:b/>
-                <w:sz w:val="17"/>
-              </w:rPr>
-              <w:t>GanaPlay Guatemala</w:t>
-            </w:r>
-          </w:p>
-        </w:tc>
-        <w:tc>
-          <w:tcPr>
-            <w:tcW w:type="dxa" w:w="1419"/>
-            <w:shd w:fill="F8FAFC"/>
-          </w:tcPr>
-          <w:p>
-            <w:pPr>
-              <w:jc w:val="center"/>
-            </w:pPr>
-            <w:r>
-              <w:rPr>
-                <w:sz w:val="17"/>
-              </w:rPr>
-              <w:t>5,107 (62.8% / 37.1%)</w:t>
-            </w:r>
-          </w:p>
-        </w:tc>
-        <w:tc>
-          <w:tcPr>
-            <w:tcW w:type="dxa" w:w="1419"/>
-            <w:shd w:fill="F8FAFC"/>
-          </w:tcPr>
-          <w:p>
-            <w:pPr>
-              <w:jc w:val="center"/>
-            </w:pPr>
-            <w:r>
-              <w:rPr>
-                <w:sz w:val="17"/>
-              </w:rPr>
-              <w:t>6,134 (60.2% / 33.4%)</w:t>
-            </w:r>
-          </w:p>
-        </w:tc>
-        <w:tc>
-          <w:tcPr>
-            <w:tcW w:type="dxa" w:w="1419"/>
-            <w:shd w:fill="F8FAFC"/>
-          </w:tcPr>
-          <w:p>
-            <w:pPr>
-              <w:jc w:val="center"/>
-            </w:pPr>
-            <w:r>
-              <w:rPr>
-                <w:sz w:val="17"/>
-              </w:rPr>
-              <w:t>+20.1%</w:t>
-            </w:r>
-          </w:p>
-        </w:tc>
-        <w:tc>
-          <w:tcPr>
-            <w:tcW w:type="dxa" w:w="1419"/>
-            <w:shd w:fill="ECFDF5"/>
-          </w:tcPr>
-          <w:p>
-            <w:pPr>
-              <w:jc w:val="center"/>
-            </w:pPr>
-            <w:r>
-              <w:rPr>
-                <w:b/>
-                <w:sz w:val="17"/>
-              </w:rPr>
-              <w:t>-2.6% 📉</w:t>
-            </w:r>
-          </w:p>
-        </w:tc>
-        <w:tc>
-          <w:tcPr>
-            <w:tcW w:type="dxa" w:w="1419"/>
-            <w:shd w:fill="F0F9FF"/>
-          </w:tcPr>
-          <w:p>
-            <w:pPr>
-              <w:jc w:val="center"/>
-            </w:pPr>
-            <w:r>
-              <w:rPr>
-                <w:sz w:val="17"/>
-              </w:rPr>
-              <w:t>-3.7%</w:t>
-            </w:r>
-          </w:p>
-        </w:tc>
-        <w:tc>
-          <w:tcPr>
-            <w:tcW w:type="dxa" w:w="1419"/>
-            <w:shd w:fill="F8FAFC"/>
-          </w:tcPr>
-          <w:p>
-            <w:pPr>
-              <w:jc w:val="left"/>
-            </w:pPr>
-            <w:r>
-              <w:rPr>
-                <w:sz w:val="17"/>
-              </w:rPr>
-              <w:t>Diagnóstico Global: Crecimiento de volumen (+20.1%). Un 2.6% correspondió a usuarios nuevos que ingresaron en Nivel Medio, requiriendo validación KYC obligatoria en su primer retiro.</w:t>
-            </w:r>
-          </w:p>
-        </w:tc>
-      </w:tr>
-      <w:tr>
-        <w:tc>
-          <w:tcPr>
-            <w:tcW w:type="dxa" w:w="1419"/>
-            <w:shd w:fill="FFFFFF"/>
-          </w:tcPr>
-          <w:p>
-            <w:pPr>
-              <w:jc w:val="left"/>
-            </w:pPr>
-            <w:r>
-              <w:rPr>
-                <w:b/>
-                <w:sz w:val="17"/>
-              </w:rPr>
-              <w:t>Doradobet Guatemala</w:t>
-            </w:r>
-          </w:p>
-        </w:tc>
-        <w:tc>
-          <w:tcPr>
-            <w:tcW w:type="dxa" w:w="1419"/>
-            <w:shd w:fill="FFFFFF"/>
-          </w:tcPr>
-          <w:p>
-            <w:pPr>
-              <w:jc w:val="center"/>
-            </w:pPr>
-            <w:r>
-              <w:rPr>
-                <w:sz w:val="17"/>
-              </w:rPr>
-              <w:t>4,039 (69.8% / 58.3%)</w:t>
-            </w:r>
-          </w:p>
-        </w:tc>
-        <w:tc>
-          <w:tcPr>
-            <w:tcW w:type="dxa" w:w="1419"/>
-            <w:shd w:fill="FFFFFF"/>
-          </w:tcPr>
-          <w:p>
-            <w:pPr>
-              <w:jc w:val="center"/>
-            </w:pPr>
-            <w:r>
-              <w:rPr>
-                <w:sz w:val="17"/>
-              </w:rPr>
-              <w:t>4,191 (68.1% / 60.0%)</w:t>
-            </w:r>
-          </w:p>
-        </w:tc>
-        <w:tc>
-          <w:tcPr>
-            <w:tcW w:type="dxa" w:w="1419"/>
-            <w:shd w:fill="FFFFFF"/>
-          </w:tcPr>
-          <w:p>
-            <w:pPr>
-              <w:jc w:val="center"/>
-            </w:pPr>
-            <w:r>
-              <w:rPr>
-                <w:sz w:val="17"/>
-              </w:rPr>
-              <w:t>+3.8%</w:t>
-            </w:r>
-          </w:p>
-        </w:tc>
-        <w:tc>
-          <w:tcPr>
-            <w:tcW w:type="dxa" w:w="1419"/>
-            <w:shd w:fill="ECFDF5"/>
-          </w:tcPr>
-          <w:p>
-            <w:pPr>
-              <w:jc w:val="center"/>
-            </w:pPr>
-            <w:r>
-              <w:rPr>
-                <w:b/>
-                <w:sz w:val="17"/>
-              </w:rPr>
-              <w:t>-1.7% = (ESTABLE)</w:t>
-            </w:r>
-          </w:p>
-        </w:tc>
-        <w:tc>
-          <w:tcPr>
-            <w:tcW w:type="dxa" w:w="1419"/>
-            <w:shd w:fill="F0F9FF"/>
-          </w:tcPr>
-          <w:p>
-            <w:pPr>
-              <w:jc w:val="center"/>
-            </w:pPr>
-            <w:r>
-              <w:rPr>
-                <w:sz w:val="17"/>
-              </w:rPr>
-              <w:t>+1.7%</w:t>
-            </w:r>
-          </w:p>
-        </w:tc>
-        <w:tc>
-          <w:tcPr>
-            <w:tcW w:type="dxa" w:w="1419"/>
-            <w:shd w:fill="FFFFFF"/>
-          </w:tcPr>
-          <w:p>
-            <w:pPr>
-              <w:jc w:val="left"/>
-            </w:pPr>
-            <w:r>
-              <w:rPr>
-                <w:sz w:val="17"/>
-              </w:rPr>
-              <w:t>Diagnóstico Global POSITIVO: Mejora del +1.7% en ejecutado real (alcanzando 60.0%) al mantenerse las solicitudes dentro del parámetro de 5,000 GTQ.</w:t>
-            </w:r>
-          </w:p>
-        </w:tc>
-      </w:tr>
-      <w:tr>
-        <w:tc>
-          <w:tcPr>
-            <w:tcW w:type="dxa" w:w="1419"/>
-            <w:shd w:fill="F8FAFC"/>
-          </w:tcPr>
-          <w:p>
-            <w:pPr>
-              <w:jc w:val="left"/>
-            </w:pPr>
-            <w:r>
-              <w:rPr>
-                <w:b/>
-                <w:sz w:val="17"/>
-              </w:rPr>
-              <w:t>Doradobet Chile</w:t>
-            </w:r>
-          </w:p>
-        </w:tc>
-        <w:tc>
-          <w:tcPr>
-            <w:tcW w:type="dxa" w:w="1419"/>
-            <w:shd w:fill="F8FAFC"/>
-          </w:tcPr>
-          <w:p>
-            <w:pPr>
-              <w:jc w:val="center"/>
-            </w:pPr>
-            <w:r>
-              <w:rPr>
-                <w:sz w:val="17"/>
-              </w:rPr>
-              <w:t>2,510 (56.9% / 45.9%)</w:t>
-            </w:r>
-          </w:p>
-        </w:tc>
-        <w:tc>
-          <w:tcPr>
-            <w:tcW w:type="dxa" w:w="1419"/>
-            <w:shd w:fill="F8FAFC"/>
-          </w:tcPr>
-          <w:p>
-            <w:pPr>
-              <w:jc w:val="center"/>
-            </w:pPr>
-            <w:r>
-              <w:rPr>
-                <w:sz w:val="17"/>
-              </w:rPr>
-              <w:t>2,327 (52.3% / 38.3%)</w:t>
-            </w:r>
-          </w:p>
-        </w:tc>
-        <w:tc>
-          <w:tcPr>
-            <w:tcW w:type="dxa" w:w="1419"/>
-            <w:shd w:fill="F8FAFC"/>
-          </w:tcPr>
-          <w:p>
-            <w:pPr>
-              <w:jc w:val="center"/>
-            </w:pPr>
-            <w:r>
-              <w:rPr>
-                <w:sz w:val="17"/>
-              </w:rPr>
-              <w:t>-7.3%</w:t>
-            </w:r>
-          </w:p>
-        </w:tc>
-        <w:tc>
-          <w:tcPr>
-            <w:tcW w:type="dxa" w:w="1419"/>
-            <w:shd w:fill="ECFDF5"/>
-          </w:tcPr>
-          <w:p>
-            <w:pPr>
-              <w:jc w:val="center"/>
-            </w:pPr>
-            <w:r>
-              <w:rPr>
-                <w:b/>
-                <w:sz w:val="17"/>
-              </w:rPr>
-              <w:t>-4.6% 📉</w:t>
-            </w:r>
-          </w:p>
-        </w:tc>
-        <w:tc>
-          <w:tcPr>
-            <w:tcW w:type="dxa" w:w="1419"/>
-            <w:shd w:fill="F0F9FF"/>
-          </w:tcPr>
-          <w:p>
-            <w:pPr>
-              <w:jc w:val="center"/>
-            </w:pPr>
-            <w:r>
-              <w:rPr>
-                <w:sz w:val="17"/>
-              </w:rPr>
-              <w:t>-7.6%</w:t>
-            </w:r>
-          </w:p>
-        </w:tc>
-        <w:tc>
-          <w:tcPr>
-            <w:tcW w:type="dxa" w:w="1419"/>
-            <w:shd w:fill="F8FAFC"/>
-          </w:tcPr>
-          <w:p>
-            <w:pPr>
-              <w:jc w:val="left"/>
-            </w:pPr>
-            <w:r>
-              <w:rPr>
-                <w:sz w:val="17"/>
-              </w:rPr>
-              <w:t>Diagnóstico Global: Un 4.6% de los usuarios subieron a Nivel Medio y un 7.6% de los retiros superaron el parámetro de 999,999 CLP, derivando a mesa manual.</w:t>
-            </w:r>
-          </w:p>
-        </w:tc>
-      </w:tr>
-      <w:tr>
-        <w:tc>
-          <w:tcPr>
-            <w:tcW w:type="dxa" w:w="1419"/>
-            <w:shd w:fill="FFFFFF"/>
-          </w:tcPr>
-          <w:p>
-            <w:pPr>
-              <w:jc w:val="left"/>
-            </w:pPr>
-            <w:r>
-              <w:rPr>
-                <w:b/>
-                <w:sz w:val="17"/>
-              </w:rPr>
-              <w:t>Doradobet Honduras</w:t>
-            </w:r>
-          </w:p>
-        </w:tc>
-        <w:tc>
-          <w:tcPr>
-            <w:tcW w:type="dxa" w:w="1419"/>
-            <w:shd w:fill="FFFFFF"/>
-          </w:tcPr>
-          <w:p>
-            <w:pPr>
-              <w:jc w:val="center"/>
-            </w:pPr>
-            <w:r>
-              <w:rPr>
-                <w:sz w:val="17"/>
-              </w:rPr>
-              <w:t>1,030 (33.6% / 11.3%)</w:t>
-            </w:r>
-          </w:p>
-        </w:tc>
-        <w:tc>
-          <w:tcPr>
-            <w:tcW w:type="dxa" w:w="1419"/>
-            <w:shd w:fill="FFFFFF"/>
-          </w:tcPr>
-          <w:p>
-            <w:pPr>
-              <w:jc w:val="center"/>
-            </w:pPr>
-            <w:r>
-              <w:rPr>
-                <w:sz w:val="17"/>
-              </w:rPr>
-              <w:t>2,027 (36.9% / 2.7%)</w:t>
-            </w:r>
-          </w:p>
-        </w:tc>
-        <w:tc>
-          <w:tcPr>
-            <w:tcW w:type="dxa" w:w="1419"/>
-            <w:shd w:fill="FFFFFF"/>
-          </w:tcPr>
-          <w:p>
-            <w:pPr>
-              <w:jc w:val="center"/>
-            </w:pPr>
-            <w:r>
-              <w:rPr>
-                <w:sz w:val="17"/>
-              </w:rPr>
-              <w:t>+96.8%</w:t>
-            </w:r>
-          </w:p>
-        </w:tc>
-        <w:tc>
-          <w:tcPr>
-            <w:tcW w:type="dxa" w:w="1419"/>
-            <w:shd w:fill="ECFDF5"/>
-          </w:tcPr>
-          <w:p>
-            <w:pPr>
-              <w:jc w:val="center"/>
-            </w:pPr>
-            <w:r>
-              <w:rPr>
-                <w:b/>
-                <w:sz w:val="17"/>
-              </w:rPr>
-              <w:t>+3.3% 📈 (SUBIÓ)</w:t>
-            </w:r>
-          </w:p>
-        </w:tc>
-        <w:tc>
-          <w:tcPr>
-            <w:tcW w:type="dxa" w:w="1419"/>
-            <w:shd w:fill="F0F9FF"/>
-          </w:tcPr>
-          <w:p>
-            <w:pPr>
-              <w:jc w:val="center"/>
-            </w:pPr>
-            <w:r>
-              <w:rPr>
-                <w:sz w:val="17"/>
-              </w:rPr>
-              <w:t>-8.6%</w:t>
-            </w:r>
-          </w:p>
-        </w:tc>
-        <w:tc>
-          <w:tcPr>
-            <w:tcW w:type="dxa" w:w="1419"/>
-            <w:shd w:fill="FFFFFF"/>
-          </w:tcPr>
-          <w:p>
-            <w:pPr>
-              <w:jc w:val="left"/>
-            </w:pPr>
-            <w:r>
-              <w:rPr>
-                <w:sz w:val="17"/>
-              </w:rPr>
-              <w:t>Diagnóstico Global: Aumento estipulado de +3.3% (al 36.9%) pese a duplicarse el volumen (+96.8%). Los retiros manuales respondieron al sobrepaso de topes de monto.</w:t>
-            </w:r>
-          </w:p>
-        </w:tc>
-      </w:tr>
-      <w:tr>
-        <w:tc>
-          <w:tcPr>
-            <w:tcW w:type="dxa" w:w="1419"/>
-            <w:shd w:fill="F8FAFC"/>
-          </w:tcPr>
-          <w:p>
-            <w:pPr>
-              <w:jc w:val="left"/>
-            </w:pPr>
-            <w:r>
-              <w:rPr>
-                <w:b/>
-                <w:sz w:val="17"/>
-              </w:rPr>
-              <w:t>Doradobet Bolivia</w:t>
-            </w:r>
-          </w:p>
-        </w:tc>
-        <w:tc>
-          <w:tcPr>
-            <w:tcW w:type="dxa" w:w="1419"/>
-            <w:shd w:fill="F8FAFC"/>
-          </w:tcPr>
-          <w:p>
-            <w:pPr>
-              <w:jc w:val="center"/>
-            </w:pPr>
-            <w:r>
-              <w:rPr>
-                <w:sz w:val="17"/>
-              </w:rPr>
-              <w:t>1,130 (39.7% / 23.6%)</w:t>
-            </w:r>
-          </w:p>
-        </w:tc>
-        <w:tc>
-          <w:tcPr>
-            <w:tcW w:type="dxa" w:w="1419"/>
-            <w:shd w:fill="F8FAFC"/>
-          </w:tcPr>
-          <w:p>
-            <w:pPr>
-              <w:jc w:val="center"/>
-            </w:pPr>
-            <w:r>
-              <w:rPr>
-                <w:sz w:val="17"/>
-              </w:rPr>
-              <w:t>1,027 (34.9% / 0.2%)</w:t>
-            </w:r>
-          </w:p>
-        </w:tc>
-        <w:tc>
-          <w:tcPr>
-            <w:tcW w:type="dxa" w:w="1419"/>
-            <w:shd w:fill="F8FAFC"/>
-          </w:tcPr>
-          <w:p>
-            <w:pPr>
-              <w:jc w:val="center"/>
-            </w:pPr>
-            <w:r>
-              <w:rPr>
-                <w:sz w:val="17"/>
-              </w:rPr>
-              <w:t>-9.1%</w:t>
-            </w:r>
-          </w:p>
-        </w:tc>
-        <w:tc>
-          <w:tcPr>
-            <w:tcW w:type="dxa" w:w="1419"/>
-            <w:shd w:fill="ECFDF5"/>
-          </w:tcPr>
-          <w:p>
-            <w:pPr>
-              <w:jc w:val="center"/>
-            </w:pPr>
-            <w:r>
-              <w:rPr>
-                <w:b/>
-                <w:sz w:val="17"/>
-              </w:rPr>
-              <w:t>-4.8% 📉</w:t>
-            </w:r>
-          </w:p>
-        </w:tc>
-        <w:tc>
-          <w:tcPr>
-            <w:tcW w:type="dxa" w:w="1419"/>
-            <w:shd w:fill="F0F9FF"/>
-          </w:tcPr>
-          <w:p>
-            <w:pPr>
-              <w:jc w:val="center"/>
-            </w:pPr>
-            <w:r>
-              <w:rPr>
-                <w:sz w:val="17"/>
-              </w:rPr>
-              <w:t>-23.4%</w:t>
-            </w:r>
-          </w:p>
-        </w:tc>
-        <w:tc>
-          <w:tcPr>
-            <w:tcW w:type="dxa" w:w="1419"/>
-            <w:shd w:fill="F8FAFC"/>
-          </w:tcPr>
-          <w:p>
-            <w:pPr>
-              <w:jc w:val="left"/>
-            </w:pPr>
-            <w:r>
-              <w:rPr>
-                <w:sz w:val="17"/>
-              </w:rPr>
-              <w:t>Diagnóstico Global: Un 4.8% de los usuarios subieron a Nivel Medio y la pasarela bancaria local requirió autorización manual para operaciones directas.</w:t>
-            </w:r>
-          </w:p>
-        </w:tc>
-      </w:tr>
-      <w:tr>
-        <w:tc>
-          <w:tcPr>
-            <w:tcW w:type="dxa" w:w="1419"/>
-            <w:shd w:fill="FFFFFF"/>
-          </w:tcPr>
-          <w:p>
-            <w:pPr>
-              <w:jc w:val="left"/>
-            </w:pPr>
-            <w:r>
-              <w:rPr>
-                <w:b/>
-                <w:sz w:val="17"/>
-              </w:rPr>
-              <w:t>Camanbet Venezuela 2</w:t>
-            </w:r>
-          </w:p>
-        </w:tc>
-        <w:tc>
-          <w:tcPr>
-            <w:tcW w:type="dxa" w:w="1419"/>
-            <w:shd w:fill="FFFFFF"/>
-          </w:tcPr>
-          <w:p>
-            <w:pPr>
-              <w:jc w:val="center"/>
-            </w:pPr>
-            <w:r>
-              <w:rPr>
-                <w:sz w:val="17"/>
-              </w:rPr>
-              <w:t>681 (78.0% / 44.2%)</w:t>
-            </w:r>
-          </w:p>
-        </w:tc>
-        <w:tc>
-          <w:tcPr>
-            <w:tcW w:type="dxa" w:w="1419"/>
-            <w:shd w:fill="FFFFFF"/>
-          </w:tcPr>
-          <w:p>
-            <w:pPr>
-              <w:jc w:val="center"/>
-            </w:pPr>
-            <w:r>
-              <w:rPr>
-                <w:sz w:val="17"/>
-              </w:rPr>
-              <w:t>748 (77.7% / 27.0%)</w:t>
-            </w:r>
-          </w:p>
-        </w:tc>
-        <w:tc>
-          <w:tcPr>
-            <w:tcW w:type="dxa" w:w="1419"/>
-            <w:shd w:fill="FFFFFF"/>
-          </w:tcPr>
-          <w:p>
-            <w:pPr>
-              <w:jc w:val="center"/>
-            </w:pPr>
-            <w:r>
-              <w:rPr>
-                <w:sz w:val="17"/>
-              </w:rPr>
-              <w:t>+9.8%</w:t>
-            </w:r>
-          </w:p>
-        </w:tc>
-        <w:tc>
-          <w:tcPr>
-            <w:tcW w:type="dxa" w:w="1419"/>
-            <w:shd w:fill="ECFDF5"/>
-          </w:tcPr>
-          <w:p>
-            <w:pPr>
-              <w:jc w:val="center"/>
-            </w:pPr>
-            <w:r>
-              <w:rPr>
-                <w:b/>
-                <w:sz w:val="17"/>
-              </w:rPr>
-              <w:t>-0.3% = (ESTABLE)</w:t>
-            </w:r>
-          </w:p>
-        </w:tc>
-        <w:tc>
-          <w:tcPr>
-            <w:tcW w:type="dxa" w:w="1419"/>
-            <w:shd w:fill="F0F9FF"/>
-          </w:tcPr>
-          <w:p>
-            <w:pPr>
-              <w:jc w:val="center"/>
-            </w:pPr>
-            <w:r>
-              <w:rPr>
-                <w:sz w:val="17"/>
-              </w:rPr>
-              <w:t>-17.2%</w:t>
-            </w:r>
-          </w:p>
-        </w:tc>
-        <w:tc>
-          <w:tcPr>
-            <w:tcW w:type="dxa" w:w="1419"/>
-            <w:shd w:fill="FFFFFF"/>
-          </w:tcPr>
-          <w:p>
-            <w:pPr>
-              <w:jc w:val="left"/>
-            </w:pPr>
-            <w:r>
-              <w:rPr>
-                <w:sz w:val="17"/>
-              </w:rPr>
-              <w:t>Diagnóstico Global: Automatización estipulada ESTABLE en 78% (-0.3%). En ejecutado real, un 16.9% de los retiros superaron el límite parametrizado en VES.</w:t>
+              <w:t>+1.47% (Aumento) 📈</w:t>
             </w:r>
           </w:p>
         </w:tc>
       </w:tr>
     </w:tbl>
+    <w:p>
+      <w:r>
+        <w:t>Diagnóstico de Reglas por Nivel de Riesgo (Junio 12 a Hoy):</w:t>
+      </w:r>
+    </w:p>
+    <w:p>
+      <w:r>
+        <w:rPr>
+          <w:b/>
+        </w:rPr>
+        <w:t>• Doradobet Chile:</w:t>
+      </w:r>
+    </w:p>
+    <w:p>
+      <w:pPr>
+        <w:pStyle w:val="ListBullet"/>
+      </w:pPr>
+      <w:r>
+        <w:rPr>
+          <w:b/>
+        </w:rPr>
+        <w:t xml:space="preserve">Riesgo Bajo: </w:t>
+      </w:r>
+      <w:r>
+        <w:t>Antes 85.2% (373/438) vs Después 75.6% (653/864) | Variación: -9.58%</w:t>
+      </w:r>
+    </w:p>
+    <w:p>
+      <w:pPr>
+        <w:pStyle w:val="ListBullet"/>
+      </w:pPr>
+      <w:r>
+        <w:rPr>
+          <w:b/>
+        </w:rPr>
+        <w:t xml:space="preserve">Riesgo Medio: </w:t>
+      </w:r>
+      <w:r>
+        <w:t>Antes 0.4% (1/259) vs Después 8.5% (29/341) | Variación: +8.12%</w:t>
+      </w:r>
+    </w:p>
+    <w:p>
+      <w:pPr>
+        <w:pStyle w:val="ListBullet"/>
+      </w:pPr>
+      <w:r>
+        <w:rPr>
+          <w:b/>
+        </w:rPr>
+        <w:t xml:space="preserve">Riesgo Sin Nivel: </w:t>
+      </w:r>
+      <w:r>
+        <w:t>Antes 19.9% (28/141) vs Después 15.2% (66/433) | Variación: -4.62%</w:t>
+      </w:r>
+    </w:p>
+    <w:p>
+      <w:r>
+        <w:rPr>
+          <w:b/>
+        </w:rPr>
+        <w:t>• Doradobet Ecuador:</w:t>
+      </w:r>
+    </w:p>
+    <w:p>
+      <w:pPr>
+        <w:pStyle w:val="ListBullet"/>
+      </w:pPr>
+      <w:r>
+        <w:rPr>
+          <w:b/>
+        </w:rPr>
+        <w:t xml:space="preserve">Riesgo Bajo: </w:t>
+      </w:r>
+      <w:r>
+        <w:t>Antes 74.4% (3997/5373) vs Después 67.1% (6070/9042) | Variación: -7.26%</w:t>
+      </w:r>
+    </w:p>
+    <w:p>
+      <w:pPr>
+        <w:pStyle w:val="ListBullet"/>
+      </w:pPr>
+      <w:r>
+        <w:rPr>
+          <w:b/>
+        </w:rPr>
+        <w:t xml:space="preserve">Riesgo Medio: </w:t>
+      </w:r>
+      <w:r>
+        <w:t>Antes 5.8% (160/2782) vs Después 12.5% (510/4081) | Variación: +6.75%</w:t>
+      </w:r>
+    </w:p>
+    <w:p>
+      <w:pPr>
+        <w:pStyle w:val="ListBullet"/>
+      </w:pPr>
+      <w:r>
+        <w:rPr>
+          <w:b/>
+        </w:rPr>
+        <w:t xml:space="preserve">Riesgo Sin Nivel: </w:t>
+      </w:r>
+      <w:r>
+        <w:t>Antes 31.8% (702/2211) vs Después 39.4% (1638/4162) | Variación: +7.61%</w:t>
+      </w:r>
+    </w:p>
+    <w:p>
+      <w:r>
+        <w:rPr>
+          <w:b/>
+        </w:rPr>
+        <w:t>• Ecuabet Ecuador:</w:t>
+      </w:r>
+    </w:p>
+    <w:p>
+      <w:pPr>
+        <w:pStyle w:val="ListBullet"/>
+      </w:pPr>
+      <w:r>
+        <w:rPr>
+          <w:b/>
+        </w:rPr>
+        <w:t xml:space="preserve">Riesgo Bajo: </w:t>
+      </w:r>
+      <w:r>
+        <w:t>Antes 83.1% (50468/60708) vs Después 80.7% (110055/136413) | Variación: -2.45%</w:t>
+      </w:r>
+    </w:p>
+    <w:p>
+      <w:pPr>
+        <w:pStyle w:val="ListBullet"/>
+      </w:pPr>
+      <w:r>
+        <w:rPr>
+          <w:b/>
+        </w:rPr>
+        <w:t xml:space="preserve">Riesgo Medio: </w:t>
+      </w:r>
+      <w:r>
+        <w:t>Antes 5.4% (673/12579) vs Después 4.7% (1516/32037) | Variación: -0.62%</w:t>
+      </w:r>
+    </w:p>
+    <w:p>
+      <w:pPr>
+        <w:pStyle w:val="ListBullet"/>
+      </w:pPr>
+      <w:r>
+        <w:rPr>
+          <w:b/>
+        </w:rPr>
+        <w:t xml:space="preserve">Riesgo Sin Nivel: </w:t>
+      </w:r>
+      <w:r>
+        <w:t>Antes 29.1% (1655/5690) vs Después 31.0% (7735/24923) | Variación: +1.95%</w:t>
+      </w:r>
+    </w:p>
+    <w:p>
+      <w:r>
+        <w:rPr>
+          <w:b/>
+        </w:rPr>
+        <w:t>• Doradobet Perú:</w:t>
+      </w:r>
+    </w:p>
+    <w:p>
+      <w:pPr>
+        <w:pStyle w:val="ListBullet"/>
+      </w:pPr>
+      <w:r>
+        <w:rPr>
+          <w:b/>
+        </w:rPr>
+        <w:t xml:space="preserve">Riesgo Bajo: </w:t>
+      </w:r>
+      <w:r>
+        <w:t>Antes 96.0% (19786/20612) vs Después 96.1% (35993/37458) | Variación: +0.10%</w:t>
+      </w:r>
+    </w:p>
+    <w:p>
+      <w:pPr>
+        <w:pStyle w:val="ListBullet"/>
+      </w:pPr>
+      <w:r>
+        <w:rPr>
+          <w:b/>
+        </w:rPr>
+        <w:t xml:space="preserve">Riesgo Medio: </w:t>
+      </w:r>
+      <w:r>
+        <w:t>Antes 4.6% (249/5416) vs Después 6.5% (548/8494) | Variación: +1.85%</w:t>
+      </w:r>
+    </w:p>
+    <w:p>
+      <w:pPr>
+        <w:pStyle w:val="ListBullet"/>
+      </w:pPr>
+      <w:r>
+        <w:rPr>
+          <w:b/>
+        </w:rPr>
+        <w:t xml:space="preserve">Riesgo Sin Nivel: </w:t>
+      </w:r>
+      <w:r>
+        <w:t>Antes 45.6% (1782/3906) vs Después 48.8% (5319/10898) | Variación: +3.19%</w:t>
+      </w:r>
+    </w:p>
+    <w:p>
+      <w:pPr>
+        <w:shd w:fill="FFF1F2"/>
+      </w:pPr>
+      <w:r>
+        <w:rPr>
+          <w:b/>
+        </w:rPr>
+        <w:t xml:space="preserve">⚠ ALERTA DE CONFIGURACIÓN OPERATIVA (Paniplay): </w:t>
+      </w:r>
+      <w:r>
+        <w:t>La matriz de parámetros autorizados no define ninguna regla para Riesgo Alto en Paniplay. A pesar de esto, la data histórica demuestra que el sistema aprueba automáticamente el 70.99% de las transacciones de riesgo Alto. Se debe auditar con el equipo técnico de inmediato esta inconsistencia en el motor de aprobación.</w:t>
+      </w:r>
+    </w:p>
+    <w:p>
+      <w:pPr>
+        <w:pStyle w:val="Heading1"/>
+        <w:keepNext/>
+        <w:spacing w:before="240" w:after="120"/>
+      </w:pPr>
+      <w:r>
+        <w:rPr>
+          <w:rFonts w:ascii="Calibri" w:hAnsi="Calibri"/>
+          <w:b/>
+          <w:color w:val="0F172A"/>
+        </w:rPr>
+        <w:t>6. Acciones Propuestas para Toma de Decisiones</w:t>
+      </w:r>
+    </w:p>
+    <w:p>
+      <w:r>
+        <w:rPr>
+          <w:b/>
+          <w:color w:val="10B981"/>
+        </w:rPr>
+        <w:t xml:space="preserve">✔  Estandarizar el Rejuego (Rollover) en 1.10 o 1.20: </w:t>
+      </w:r>
+      <w:r>
+        <w:t>Para equilibrar seguridad y volumen de automatización, se sugiere unificar criterios: subir el Rejuego en Doradobet (de 1.01 a 1.10/1.20) y exigir Rentabilidad Mínima de 0.10 para blindar el canal contra lavado, y bajarlo en Camanbet (de 3.00 a 1.50/1.20 en moneda local VES con Rentabilidad Mínima 0.20) para destrabar la aprobación automática de usuarios legítimos.</w:t>
+      </w:r>
+    </w:p>
+    <w:p>
+      <w:r>
+        <w:rPr>
+          <w:b/>
+          <w:color w:val="10B981"/>
+        </w:rPr>
+        <w:t xml:space="preserve">✔  Configurar Reglas para Riesgo Medio en Marcas en Blanco: </w:t>
+      </w:r>
+      <w:r>
+        <w:t>Marcas como Doradobet Chile (CLP) y Honduras (HNL) no tienen parametrizadas reglas de aprobación para riesgo Medio. Habilitarlas bajo un límite de retiro moderado en moneda local (ej. 500,000 CLP en Chile o 5,000 HNL en Honduras), exigiendo Rentabilidad Mínima de 0.20 y similitud de IP del 80-90% incrementará significativamente el porcentaje global.</w:t>
+      </w:r>
+    </w:p>
+    <w:p>
+      <w:r>
+        <w:rPr>
+          <w:b/>
+          <w:color w:val="10B981"/>
+        </w:rPr>
+        <w:t xml:space="preserve">✔  Alinear Límites en Riesgo Medio (Perú): </w:t>
+      </w:r>
+      <w:r>
+        <w:t>En Doradobet Perú (PEN), el límite de retiro automático en riesgo Medio es de 1,999 PEN (Rentabilidad Mínima 0.12) frente a 5,000 PEN de riesgo Bajo (Rentabilidad Mínima 0.01). Incrementar el límite de riesgo Medio a 3,000 PEN capturará gran volumen de retiros seguros de forma inmediata.</w:t>
+      </w:r>
+    </w:p>
     <w:sectPr>
       <w:pgSz w:w="12240" w:h="15840"/>
-      <w:pgMar w:top="1152" w:right="1152" w:bottom="1152" w:left="1152" w:header="720" w:footer="720" w:gutter="0"/>
+      <w:pgMar w:top="1440" w:right="1440" w:bottom="1440" w:left="1440" w:header="720" w:footer="720" w:gutter="0"/>
       <w:cols w:space="720"/>
       <w:docGrid w:linePitch="360"/>
     </w:sectPr>
@@ -2317,6 +1312,11 @@
     <w:name w:val="Normal"/>
     <w:qFormat/>
     <w:rsid w:val="00FC693F"/>
+    <w:rPr>
+      <w:rFonts w:ascii="Calibri" w:hAnsi="Calibri"/>
+      <w:color w:val="334155"/>
+      <w:sz w:val="22"/>
+    </w:rPr>
   </w:style>
   <w:style w:type="paragraph" w:styleId="Header">
     <w:name w:val="header"/>

</xml_diff>